<commit_message>
Revise per reviewer: pre-warm API and add benchmark (P2-01), dynamic route inventory (P1-01), fix report ToC/numbering/compliance wording (P3-01)
</commit_message>
<xml_diff>
--- a/data/metadata/change_log.docx
+++ b/data/metadata/change_log.docx
@@ -16,7 +16,7 @@
     </w:p>
     <w:p>
       <w:r>
-        <w:t>Ngày tạo: 2026-07-31 15:09  |  Người nhận xét: GS. TSKH. Ngô Đăng Lưu</w:t>
+        <w:t>Ngày tạo: 2026-08-01 00:05  |  Người nhận xét: GS. TSKH. Ngô Đăng Lưu</w:t>
       </w:r>
     </w:p>
     <w:p>
@@ -867,24 +867,24 @@
               <w:spacing w:before="20" w:after="20"/>
             </w:pPr>
             <w:r>
-              <w:t>API used a default key file and no latency benchmark existed.</w:t>
-            </w:r>
-          </w:p>
-        </w:tc>
-        <w:tc>
-          <w:tcPr>
-            <w:tcW w:w="3200" w:type="dxa"/>
-            <w:tcMar>
-              <w:left w:w="60" w:type="dxa"/>
-              <w:right w:w="60" w:type="dxa"/>
-            </w:tcMar>
-          </w:tcPr>
-          <w:p>
-            <w:pPr>
-              <w:spacing w:before="20" w:after="20"/>
-            </w:pPr>
-            <w:r>
-              <w:t>src/api.py, run_api.bat, scripts/api_benchmark.py</w:t>
+              <w:t>API used a default key file and no real latency benchmark existed; the first /predict lazy-loaded models on the request path (unbounded cold-load tail) with no timeout.</w:t>
+            </w:r>
+          </w:p>
+        </w:tc>
+        <w:tc>
+          <w:tcPr>
+            <w:tcW w:w="3200" w:type="dxa"/>
+            <w:tcMar>
+              <w:left w:w="60" w:type="dxa"/>
+              <w:right w:w="60" w:type="dxa"/>
+            </w:tcMar>
+          </w:tcPr>
+          <w:p>
+            <w:pPr>
+              <w:spacing w:before="20" w:after="20"/>
+            </w:pPr>
+            <w:r>
+              <w:t>src/api.py, run_api.bat, scripts/api_benchmark.py, scripts/benchmark_api.py</w:t>
             </w:r>
           </w:p>
         </w:tc>
@@ -901,7 +901,7 @@
               <w:spacing w:before="20" w:after="20"/>
             </w:pPr>
             <w:r>
-              <w:t>API_KEY env-only fail-closed auth (no default, 503 when unset); run_api.bat no longer uses --reload; api_benchmark.csv with p50/p95/max latency and fail-closed checks</w:t>
+              <w:t>API_KEY env-only fail-closed auth (no default, 503 when unset); run_api.bat no longer uses --reload; background pre-warm at startup (PREWARM_MODELS), per-model lock (no thundering-herd double loads), MODEL_LOAD_TIMEOUT -&gt; 503; api_benchmark.csv with startup time, RAM, cold-vs-warm p50/p95/p99 and cold-load tail probe (worst observed request ~0.2s vs reviewer's ~96s claim)</w:t>
             </w:r>
           </w:p>
         </w:tc>
@@ -937,41 +937,41 @@
               <w:spacing w:before="20" w:after="20"/>
             </w:pPr>
             <w:r>
-              <w:t>P3-01: Báo cáo thiếu chuẩn hóa số liệu và hình</w:t>
-            </w:r>
-          </w:p>
-        </w:tc>
-        <w:tc>
-          <w:tcPr>
-            <w:tcW w:w="3200" w:type="dxa"/>
-            <w:tcMar>
-              <w:left w:w="60" w:type="dxa"/>
-              <w:right w:w="60" w:type="dxa"/>
-            </w:tcMar>
-          </w:tcPr>
-          <w:p>
-            <w:pPr>
-              <w:spacing w:before="20" w:after="20"/>
-            </w:pPr>
-            <w:r>
-              <w:t>Report numbers were partially hand-entered; figures not all referenced.</w:t>
-            </w:r>
-          </w:p>
-        </w:tc>
-        <w:tc>
-          <w:tcPr>
-            <w:tcW w:w="3200" w:type="dxa"/>
-            <w:tcMar>
-              <w:left w:w="60" w:type="dxa"/>
-              <w:right w:w="60" w:type="dxa"/>
-            </w:tcMar>
-          </w:tcPr>
-          <w:p>
-            <w:pPr>
-              <w:spacing w:before="20" w:after="20"/>
-            </w:pPr>
-            <w:r>
-              <w:t>generate_report.py, main.py</w:t>
+              <w:t>P3-01: Báo cáo còn lỗi trình bày và truy vết</w:t>
+            </w:r>
+          </w:p>
+        </w:tc>
+        <w:tc>
+          <w:tcPr>
+            <w:tcW w:w="3200" w:type="dxa"/>
+            <w:tcMar>
+              <w:left w:w="60" w:type="dxa"/>
+              <w:right w:w="60" w:type="dxa"/>
+            </w:tcMar>
+          </w:tcPr>
+          <w:p>
+            <w:pPr>
+              <w:spacing w:before="20" w:after="20"/>
+            </w:pPr>
+            <w:r>
+              <w:t>ToC had an empty section 8 and hardcoded page numbers that did not match actual pages; chapters/subsections were numbered inconsistently; endpoints documented as //health //predict; 'fully compliant' claims made without citing doc code/version/criterion; conformal status contradicted itself; long table cells were clipped.</w:t>
+            </w:r>
+          </w:p>
+        </w:tc>
+        <w:tc>
+          <w:tcPr>
+            <w:tcW w:w="3200" w:type="dxa"/>
+            <w:tcMar>
+              <w:left w:w="60" w:type="dxa"/>
+              <w:right w:w="60" w:type="dxa"/>
+            </w:tcMar>
+          </w:tcPr>
+          <w:p>
+            <w:pPr>
+              <w:spacing w:before="20" w:after="20"/>
+            </w:pPr>
+            <w:r>
+              <w:t>generate_report.py, configs/compliance_matrix.csv, docs/feature_status.md, run_all.bat, scripts/package_submission.py</w:t>
             </w:r>
           </w:p>
         </w:tc>
@@ -988,7 +988,7 @@
               <w:spacing w:before="20" w:after="20"/>
             </w:pPr>
             <w:r>
-              <w:t>Report regenerated automatically from outputs; dynamic counts throughout; all tables list data scope, n_samples and normalization</w:t>
+              <w:t>ToC now generated by a two-pass render with real page numbers (no empty entries); subsection numbering fixed (9.x, 11.x); endpoints shown with a single leading slash; compliance claims cite the concrete Section 15 output schema instead of an unqualified 'fully compliant'; traceability matrix and roadmap requirement counts aligned (16 requirements, added 4.16); long table cells wrap instead of clipping; run_all.bat captures 'pytest tests/ -v &gt; pytest_report.txt' and regenerates the PDF</w:t>
             </w:r>
           </w:p>
         </w:tc>

</xml_diff>

<commit_message>
Fix alert FAR terminology and package Version 2.2 submission bundle.
Correct false_alarm_rate to FPR=FP/(FP+TN), export FDR/confusion-matrix columns with screening-only labels, regenerate report evidence, and ship Latest_Requirements folder layout via package_submission.py.

Co-authored-by: Cursor <cursoragent@cursor.com>
</commit_message>
<xml_diff>
--- a/data/metadata/change_log.docx
+++ b/data/metadata/change_log.docx
@@ -16,7 +16,7 @@
     </w:p>
     <w:p>
       <w:r>
-        <w:t>Ngày tạo: 2026-08-01 00:05  |  Người nhận xét: GS. TSKH. Ngô Đăng Lưu</w:t>
+        <w:t>Ngày tạo: 2026-08-03 14:25  |  Người nhận xét: GS. TSKH. Ngô Đăng Lưu</w:t>
       </w:r>
     </w:p>
     <w:p>
@@ -763,41 +763,41 @@
               <w:spacing w:before="20" w:after="20"/>
             </w:pPr>
             <w:r>
-              <w:t>P1-05: ramp/anomaly/failure chưa được kiểm chứng ground truth</w:t>
-            </w:r>
-          </w:p>
-        </w:tc>
-        <w:tc>
-          <w:tcPr>
-            <w:tcW w:w="3200" w:type="dxa"/>
-            <w:tcMar>
-              <w:left w:w="60" w:type="dxa"/>
-              <w:right w:w="60" w:type="dxa"/>
-            </w:tcMar>
-          </w:tcPr>
-          <w:p>
-            <w:pPr>
-              <w:spacing w:before="20" w:after="20"/>
-            </w:pPr>
-            <w:r>
-              <w:t>Outputs were labelled as fault forecasts without verification.</w:t>
-            </w:r>
-          </w:p>
-        </w:tc>
-        <w:tc>
-          <w:tcPr>
-            <w:tcW w:w="3200" w:type="dxa"/>
-            <w:tcMar>
-              <w:left w:w="60" w:type="dxa"/>
-              <w:right w:w="60" w:type="dxa"/>
-            </w:tcMar>
-          </w:tcPr>
-          <w:p>
-            <w:pPr>
-              <w:spacing w:before="20" w:after="20"/>
-            </w:pPr>
-            <w:r>
-              <w:t>generate_outputs.py, main.py</w:t>
+              <w:t>P1-05 / Latest P0-07: FAR terminology + screening semantics</w:t>
+            </w:r>
+          </w:p>
+        </w:tc>
+        <w:tc>
+          <w:tcPr>
+            <w:tcW w:w="3200" w:type="dxa"/>
+            <w:tcMar>
+              <w:left w:w="60" w:type="dxa"/>
+              <w:right w:w="60" w:type="dxa"/>
+            </w:tcMar>
+          </w:tcPr>
+          <w:p>
+            <w:pPr>
+              <w:spacing w:before="20" w:after="20"/>
+            </w:pPr>
+            <w:r>
+              <w:t>CSV column false_alarm_rate stored FDR=1-precision instead of FPR=FP/(FP+TN); alerts were easy to misread as confirmed fault forecasts.</w:t>
+            </w:r>
+          </w:p>
+        </w:tc>
+        <w:tc>
+          <w:tcPr>
+            <w:tcW w:w="3200" w:type="dxa"/>
+            <w:tcMar>
+              <w:left w:w="60" w:type="dxa"/>
+              <w:right w:w="60" w:type="dxa"/>
+            </w:tcMar>
+          </w:tcPr>
+          <w:p>
+            <w:pPr>
+              <w:spacing w:before="20" w:after="20"/>
+            </w:pPr>
+            <w:r>
+              <w:t>src/evaluate.py, generate_outputs.py, generate_report.py, tests/test_compliance.py</w:t>
             </w:r>
           </w:p>
         </w:tc>
@@ -814,7 +814,7 @@
               <w:spacing w:before="20" w:after="20"/>
             </w:pPr>
             <w:r>
-              <w:t>All alert files carry method=heuristic_screening, confirmed=False, verification_status=SCREENING_ONLY; alert_screening_summary.json documents the claim limits</w:t>
+              <w:t>alert_accuracy.csv / anomaly_accuracy.csv now export TP/FP/FN/TN, false_alarm_ratio (FDR), false_alarm_rate (FPR), specificity, balanced_accuracy, prevalence, method=heuristic_screening, confirmed=False, verification_status=SCREENING_ONLY; unit test recomputes FAR formulas from the confusion matrix</w:t>
             </w:r>
           </w:p>
         </w:tc>

</xml_diff>